<commit_message>
Roles correctos en pantalla CREADORES y plan consistente
- Menu.cpp (pantalla CREADORES del juego): roles actualizados a la
  division real: Gustavo = Nivel 1 (avance) y todos; Bryan =
  instrucciones; Lenin = creditos; Biary = plan de actividades;
  Mustafa = UML.
- Plan_de_Actividades.docx: la seccion "Distribucion de
  responsabilidades" ahora coincide con la tabla y con la pantalla.
- PC1_FUENTE.TXT regenerado.

https://claude.ai/code/session_01UmirVF5HKyNN8gFhDMPJYf
</commit_message>
<xml_diff>
--- a/PoliNavis/Entregables/Plan_de_Actividades.docx
+++ b/PoliNavis/Entregables/Plan_de_Actividades.docx
@@ -8,7 +8,6 @@
       </w:pPr>
       <w:r>
         <w:rPr>
-          <w:rFonts w:ascii="Arial" w:hAnsi="Arial"/>
           <w:b/>
           <w:sz w:val="30"/>
         </w:rPr>
@@ -32,14 +31,10 @@
       <w:r>
         <w:rPr>
           <w:b/>
-          <w:sz w:val="22"/>
         </w:rPr>
         <w:t xml:space="preserve">Curso: </w:t>
       </w:r>
       <w:r>
-        <w:rPr>
-          <w:sz w:val="22"/>
-        </w:rPr>
         <w:t>Algoritmos de Programacion (1ACC0265)</w:t>
       </w:r>
     </w:p>
@@ -47,14 +42,10 @@
       <w:r>
         <w:rPr>
           <w:b/>
-          <w:sz w:val="22"/>
         </w:rPr>
         <w:t xml:space="preserve">Proyecto: </w:t>
       </w:r>
       <w:r>
-        <w:rPr>
-          <w:sz w:val="22"/>
-        </w:rPr>
         <w:t>PoliNavis: Viaje Interestelar</w:t>
       </w:r>
     </w:p>
@@ -948,11 +939,79 @@
       <w:r>
         <w:rPr>
           <w:b/>
+          <w:sz w:val="24"/>
         </w:rPr>
-        <w:t xml:space="preserve">Nota: </w:t>
+        <w:t>Distribucion de responsabilidades</w:t>
+      </w:r>
+    </w:p>
+    <w:p>
+      <w:pPr>
+        <w:pStyle w:val="ListBullet"/>
+      </w:pPr>
+      <w:r>
+        <w:rPr>
+          <w:b/>
+        </w:rPr>
+        <w:t xml:space="preserve">Gustavo Arimana: </w:t>
       </w:r>
       <w:r>
-        <w:t>el desarrollo del juego (Nivel 1 y Nivel 2) fue trabajo de todo el equipo, liderado por Gustavo. Cada integrante se encargo ademas de un entregable especifico.</w:t>
+        <w:t>Nivel 1 - desarrollo del juego (avance), junto con todo el equipo.</w:t>
+      </w:r>
+    </w:p>
+    <w:p>
+      <w:pPr>
+        <w:pStyle w:val="ListBullet"/>
+      </w:pPr>
+      <w:r>
+        <w:rPr>
+          <w:b/>
+        </w:rPr>
+        <w:t xml:space="preserve">Bryan Cordova: </w:t>
+      </w:r>
+      <w:r>
+        <w:t>Instrucciones.</w:t>
+      </w:r>
+    </w:p>
+    <w:p>
+      <w:pPr>
+        <w:pStyle w:val="ListBullet"/>
+      </w:pPr>
+      <w:r>
+        <w:rPr>
+          <w:b/>
+        </w:rPr>
+        <w:t xml:space="preserve">Lenin Palomino: </w:t>
+      </w:r>
+      <w:r>
+        <w:t>Creditos.</w:t>
+      </w:r>
+    </w:p>
+    <w:p>
+      <w:pPr>
+        <w:pStyle w:val="ListBullet"/>
+      </w:pPr>
+      <w:r>
+        <w:rPr>
+          <w:b/>
+        </w:rPr>
+        <w:t xml:space="preserve">Biary Tineo: </w:t>
+      </w:r>
+      <w:r>
+        <w:t>Plan de actividades.</w:t>
+      </w:r>
+    </w:p>
+    <w:p>
+      <w:pPr>
+        <w:pStyle w:val="ListBullet"/>
+      </w:pPr>
+      <w:r>
+        <w:rPr>
+          <w:b/>
+        </w:rPr>
+        <w:t xml:space="preserve">Mustafa Altuntas: </w:t>
+      </w:r>
+      <w:r>
+        <w:t>UML (diagrama de clases).</w:t>
       </w:r>
     </w:p>
     <w:sectPr>

</xml_diff>